<commit_message>
Adding modified Guia Primer Corte
</commit_message>
<xml_diff>
--- a/5S4/PROYECTO-FINAL/DOCUMENTACION_DE_LA_EMPRESA/DOCUMENTACION_EXISTENTE/INVENTARIO DE EQUIPOS INFORMÁTICOS.docx
+++ b/5S4/PROYECTO-FINAL/DOCUMENTACION_DE_LA_EMPRESA/DOCUMENTACION_EXISTENTE/INVENTARIO DE EQUIPOS INFORMÁTICOS.docx
@@ -9,7 +9,6 @@
           <w:bCs/>
         </w:rPr>
       </w:pPr>
-      <w:bookmarkStart w:id="0" w:name="_GoBack"/>
       <w:r>
         <w:rPr>
           <w:b/>
@@ -55,7 +54,6 @@
             <w:vAlign w:val="center"/>
             <w:hideMark/>
           </w:tcPr>
-          <w:bookmarkEnd w:id="0"/>
           <w:p>
             <w:r>
               <w:rPr>
@@ -354,7 +352,12 @@
           </w:tcPr>
           <w:p>
             <w:r>
-              <w:t>[Indicar, ej. Actualización trimestral]</w:t>
+              <w:t>[</w:t>
+            </w:r>
+            <w:bookmarkStart w:id="0" w:name="_GoBack"/>
+            <w:bookmarkEnd w:id="0"/>
+            <w:r>
+              <w:t>Actualización trimestral]</w:t>
             </w:r>
           </w:p>
         </w:tc>
@@ -5755,6 +5758,7 @@
   <w:style w:type="character" w:default="1" w:styleId="Fuentedeprrafopredeter">
     <w:name w:val="Default Paragraph Font"/>
     <w:uiPriority w:val="1"/>
+    <w:semiHidden/>
     <w:unhideWhenUsed/>
   </w:style>
   <w:style w:type="table" w:default="1" w:styleId="Tablanormal">
@@ -5944,6 +5948,7 @@
   <w:style w:type="character" w:default="1" w:styleId="Fuentedeprrafopredeter">
     <w:name w:val="Default Paragraph Font"/>
     <w:uiPriority w:val="1"/>
+    <w:semiHidden/>
     <w:unhideWhenUsed/>
   </w:style>
   <w:style w:type="table" w:default="1" w:styleId="Tablanormal">

</xml_diff>